<commit_message>
content(assignment-06): revise questions and release on 15 October
Fix the Air Canada and Gemini dates, drop the overlapping Gemini test
question, replace the datasheet bonus with the model card bluff, and
move the release after Lecture 14.
</commit_message>
<xml_diff>
--- a/assignments/06-assignment.docx
+++ b/assignments/06-assignment.docx
@@ -252,7 +252,7 @@
         <w:pStyle w:val="Heading3"/>
       </w:pPr>
       <w:r>
-        <w:t xml:space="preserve">Question 1: The DPD Chatbot Post-Mortem</w:t>
+        <w:t xml:space="preserve">Question 1: The DPD chatbot post-mortem</w:t>
       </w:r>
     </w:p>
     <w:p>
@@ -260,27 +260,16 @@
         <w:pStyle w:val="FirstParagraph"/>
       </w:pPr>
       <w:r>
-        <w:t xml:space="preserve">In January 2024, DPD (a UK delivery company) pushed an update to their AI customer service chatbot. After the update, customer Ashley Beauchamp discovered the chatbot would swear at customers, write poems criticising DPD, and call itself</w:t>
-      </w:r>
-      <w:r>
-        <w:t xml:space="preserve"> </w:t>
-      </w:r>
-      <w:r>
-        <w:t xml:space="preserve">“useless.”</w:t>
-      </w:r>
-      <w:r>
-        <w:t xml:space="preserve"> </w:t>
-      </w:r>
-      <w:r>
-        <w:t xml:space="preserve">Screenshots went viral on social media. DPD immediately shut the chatbot down and apologised.</w:t>
-      </w:r>
-    </w:p>
-    <w:p>
-      <w:pPr>
-        <w:pStyle w:val="BodyText"/>
-      </w:pPr>
-      <w:r>
-        <w:t xml:space="preserve">The root cause? A system update broke the content filtering, the safety guardrails that stop the chatbot from saying inappropriate things. Nobody noticed until customers started posting screenshots online.</w:t>
+        <w:t xml:space="preserve">In January 2024, a customer called Ashley Beauchamp found that the customer service chatbot of DPD, a UK delivery company, would swear at customers, write poems criticising DPD, and call itself</w:t>
+      </w:r>
+      <w:r>
+        <w:t xml:space="preserve"> </w:t>
+      </w:r>
+      <w:r>
+        <w:t xml:space="preserve">“useless”</w:t>
+      </w:r>
+      <w:r>
+        <w:t xml:space="preserve">. The screenshots went viral. DPD disabled the AI part of the chatbot and blamed an error that occurred after a system update. Nobody at the company noticed until customers started posting screenshots online.</w:t>
       </w:r>
     </w:p>
     <w:p>
@@ -303,7 +292,7 @@
         </w:numPr>
       </w:pPr>
       <w:r>
-        <w:t xml:space="preserve">In Lecture 14, we described the AI pipeline as a series of steps: browser → load balancers → preprocessing → tokenisation → model → postprocessing → safety filters → response. Which step in this pipeline broke when DPD pushed their update? Explain your reasoning.</w:t>
+        <w:t xml:space="preserve">Lecture 14 described the AI pipeline as a series of steps: browser → load balancers → preprocessing → tokenisation → model → postprocessing → safety filters → response. Which step failed at DPD? Explain your reasoning.</w:t>
       </w:r>
     </w:p>
     <w:p>
@@ -330,7 +319,7 @@
         <w:t xml:space="preserve"> </w:t>
       </w:r>
       <w:r>
-        <w:t xml:space="preserve">that DPD could have had in place to catch this problem</w:t>
+        <w:t xml:space="preserve">that could have caught the problem</w:t>
       </w:r>
       <w:r>
         <w:t xml:space="preserve"> </w:t>
@@ -346,16 +335,19 @@
         <w:t xml:space="preserve"> </w:t>
       </w:r>
       <w:r>
-        <w:t xml:space="preserve">customers found it. For each check, explain what it would measure and what threshold would trigger an alert. Be specific, don’t just say</w:t>
-      </w:r>
-      <w:r>
-        <w:t xml:space="preserve"> </w:t>
-      </w:r>
-      <w:r>
-        <w:t xml:space="preserve">“monitor quality”</w:t>
-      </w:r>
-      <w:r>
-        <w:t xml:space="preserve">; say</w:t>
+        <w:t xml:space="preserve">customers did. For each check, say what it measures and what threshold would trigger an alert.</w:t>
+      </w:r>
+      <w:r>
+        <w:t xml:space="preserve"> </w:t>
+      </w:r>
+      <w:r>
+        <w:t xml:space="preserve">“Monitor quality”</w:t>
+      </w:r>
+      <w:r>
+        <w:t xml:space="preserve"> </w:t>
+      </w:r>
+      <w:r>
+        <w:t xml:space="preserve">is not enough: say</w:t>
       </w:r>
       <w:r>
         <w:t xml:space="preserve"> </w:t>
@@ -371,7 +363,7 @@
         <w:t xml:space="preserve"> </w:t>
       </w:r>
       <w:r>
-        <w:t xml:space="preserve">you’d monitor it.</w:t>
+        <w:t xml:space="preserve">you would measure it.</w:t>
       </w:r>
     </w:p>
     <w:p>
@@ -382,7 +374,7 @@
         </w:numPr>
       </w:pPr>
       <w:r>
-        <w:t xml:space="preserve">Lecture 14 explained that testing AI is harder than testing traditional software because AI is</w:t>
+        <w:t xml:space="preserve">Lecture 14 said AI is harder to test than traditional software because it is</w:t>
       </w:r>
       <w:r>
         <w:t xml:space="preserve"> </w:t>
@@ -395,10 +387,7 @@
         <w:t xml:space="preserve">non-deterministic</w:t>
       </w:r>
       <w:r>
-        <w:t xml:space="preserve"> </w:t>
-      </w:r>
-      <w:r>
-        <w:t xml:space="preserve">(same input can produce different outputs). In a few sentences, explain why this makes it difficult to test whether a chatbot’s content filter is working properly. What kind of test (safety, format, consistency, boundary, bias, or regression) would be most useful here?</w:t>
+        <w:t xml:space="preserve">: the same input can give different outputs. In a few sentences, explain why this makes a content filter hard to test. Which test type from Lecture 14 (safety, format, consistency, boundary, bias or regression) would help most here?</w:t>
       </w:r>
     </w:p>
     <w:p>
@@ -452,13 +441,13 @@
       </w:r>
     </w:p>
     <w:bookmarkEnd w:id="9"/>
-    <w:bookmarkStart w:id="10" w:name="question-2-data-drift-after-covid"/>
+    <w:bookmarkStart w:id="10" w:name="question-2-drift-after-covid"/>
     <w:p>
       <w:pPr>
         <w:pStyle w:val="Heading3"/>
       </w:pPr>
       <w:r>
-        <w:t xml:space="preserve">Question 2: Data Drift after COVID</w:t>
+        <w:t xml:space="preserve">Question 2: Drift after COVID</w:t>
       </w:r>
     </w:p>
     <w:p>
@@ -466,7 +455,7 @@
         <w:pStyle w:val="FirstParagraph"/>
       </w:pPr>
       <w:r>
-        <w:t xml:space="preserve">Imagine a restaurant recommendation app trained on user reviews and ratings collected between 2017 and 2019. The app learns which restaurants people like based on cuisine type, price range, location, and review sentiment. Then COVID hits in 2020, and the world changes.</w:t>
+        <w:t xml:space="preserve">Imagine a restaurant recommendation app trained on reviews and ratings from 2017 to 2019. It learns which restaurants people like from cuisine type, price range, location and review sentiment. Then COVID arrives in 2020.</w:t>
       </w:r>
     </w:p>
     <w:p>
@@ -602,7 +591,7 @@
         </w:numPr>
       </w:pPr>
       <w:r>
-        <w:t xml:space="preserve">Describe one specific example of</w:t>
+        <w:t xml:space="preserve">Give one specific example of</w:t>
       </w:r>
       <w:r>
         <w:t xml:space="preserve"> </w:t>
@@ -618,7 +607,7 @@
         <w:t xml:space="preserve"> </w:t>
       </w:r>
       <w:r>
-        <w:t xml:space="preserve">that could affect this restaurant app after COVID. (Hint: did the meaning of a</w:t>
+        <w:t xml:space="preserve">that could affect the app after COVID. (Hint: did the meaning of a</w:t>
       </w:r>
       <w:r>
         <w:t xml:space="preserve"> </w:t>
@@ -641,7 +630,7 @@
         </w:numPr>
       </w:pPr>
       <w:r>
-        <w:t xml:space="preserve">Describe one specific example of</w:t>
+        <w:t xml:space="preserve">Give one specific example of</w:t>
       </w:r>
       <w:r>
         <w:t xml:space="preserve"> </w:t>
@@ -654,10 +643,7 @@
         <w:t xml:space="preserve">data drift</w:t>
       </w:r>
       <w:r>
-        <w:t xml:space="preserve"> </w:t>
-      </w:r>
-      <w:r>
-        <w:t xml:space="preserve">— how did the types of reviews or the kinds of users submitting reviews change?</w:t>
+        <w:t xml:space="preserve">. How did the reviews, or the people writing them, change?</w:t>
       </w:r>
     </w:p>
     <w:p>
@@ -668,7 +654,7 @@
         </w:numPr>
       </w:pPr>
       <w:r>
-        <w:t xml:space="preserve">Describe one specific example of</w:t>
+        <w:t xml:space="preserve">Give one specific example of</w:t>
       </w:r>
       <w:r>
         <w:t xml:space="preserve"> </w:t>
@@ -681,10 +667,7 @@
         <w:t xml:space="preserve">label drift</w:t>
       </w:r>
       <w:r>
-        <w:t xml:space="preserve"> </w:t>
-      </w:r>
-      <w:r>
-        <w:t xml:space="preserve">— how did the distribution of star ratings shift?</w:t>
+        <w:t xml:space="preserve">. How did the distribution of star ratings change?</w:t>
       </w:r>
     </w:p>
     <w:p>
@@ -695,7 +678,7 @@
         </w:numPr>
       </w:pPr>
       <w:r>
-        <w:t xml:space="preserve">For each type of drift, propose one way the company could detect that it’s happening. Be concrete: what data would you compare, and what pattern would you look for?</w:t>
+        <w:t xml:space="preserve">For each type of drift, propose one way the company could detect it. Say what data you would compare and what pattern you would look for.</w:t>
       </w:r>
     </w:p>
     <w:p>
@@ -755,7 +738,7 @@
         <w:pStyle w:val="Heading3"/>
       </w:pPr>
       <w:r>
-        <w:t xml:space="preserve">Question 3: Output Validation and the Air Canada Chatbot</w:t>
+        <w:t xml:space="preserve">Question 3: Output validation and the Air Canada chatbot</w:t>
       </w:r>
     </w:p>
     <w:p>
@@ -763,7 +746,7 @@
         <w:pStyle w:val="FirstParagraph"/>
       </w:pPr>
       <w:r>
-        <w:t xml:space="preserve">In 2024, Air Canada’s customer service chatbot told a grieving customer he could book a full-fare flight and then apply for a bereavement discount within 90 days. This policy did not exist, the chatbot invented it! The customer booked the flight, was denied the discount, and sued. Air Canada lost the lawsuit.</w:t>
+        <w:t xml:space="preserve">In November 2022, Air Canada’s customer service chatbot told a grieving customer he could book a full-fare flight and then apply for a bereavement discount within 90 days. That policy did not exist: the chatbot invented it. The customer booked the flight, was denied the discount, and took Air Canada to a tribunal. In February 2024, the tribunal ruled against Air Canada and ordered it to refund the difference.</w:t>
       </w:r>
     </w:p>
     <w:p>
@@ -771,7 +754,7 @@
         <w:pStyle w:val="BodyText"/>
       </w:pPr>
       <w:r>
-        <w:t xml:space="preserve">The problem was not the model itself, but that the chatbot’s response went directly to the customer with no checks in between.</w:t>
+        <w:t xml:space="preserve">The model made a mistake, but the bigger failure was that its response went straight to the customer with no checks in between.</w:t>
       </w:r>
     </w:p>
     <w:p>
@@ -810,7 +793,7 @@
         <w:t xml:space="preserve"> </w:t>
       </w:r>
       <w:r>
-        <w:t xml:space="preserve">that Air Canada could have placed between the model’s response and the customer. For each check, describe: (a) what it looks for, (b) what happens when a response fails the check, and (c) how it would have caught the fake bereavement policy. Be specific.</w:t>
+        <w:t xml:space="preserve">that Air Canada could have placed between the model’s response and the customer. For each check, describe (a) what it looks for, (b) what happens when a response fails it, and (c) how it would have caught the invented bereavement policy.</w:t>
       </w:r>
     </w:p>
     <w:p>
@@ -821,7 +804,7 @@
         </w:numPr>
       </w:pPr>
       <w:r>
-        <w:t xml:space="preserve">One approach to output validation is called</w:t>
+        <w:t xml:space="preserve">Lecture 14 introduced</w:t>
       </w:r>
       <w:r>
         <w:t xml:space="preserve"> </w:t>
@@ -834,19 +817,7 @@
         <w:t xml:space="preserve">LLM-as-a-Judge</w:t>
       </w:r>
       <w:r>
-        <w:t xml:space="preserve">. For example, a</w:t>
-      </w:r>
-      <w:r>
-        <w:t xml:space="preserve"> </w:t>
-      </w:r>
-      <w:r>
-        <w:t xml:space="preserve">“judge”</w:t>
-      </w:r>
-      <w:r>
-        <w:t xml:space="preserve"> </w:t>
-      </w:r>
-      <w:r>
-        <w:t xml:space="preserve">model could check whether the chatbot’s answer matches the company’s actual policy documents. In a few sentences, explain one advantage and one limitation of this approach. Why can’t you fully trust an AI to judge another AI?</w:t>
+        <w:t xml:space="preserve">: a second model checks the first model’s output. Here, a judge model could check whether the chatbot’s answer matches Air Canada’s real policy documents. In a few sentences, give one advantage and one limitation of this approach. Why can’t you fully trust one AI to judge another?</w:t>
       </w:r>
     </w:p>
     <w:p>
@@ -857,7 +828,7 @@
         </w:numPr>
       </w:pPr>
       <w:r>
-        <w:t xml:space="preserve">When an AI chatbot gives incorrect advice and a customer suffers because of it, who should be held responsible: the AI company that built the chatbot, the business that deployed it (Air Canada), or the customer for trusting it? Pick a position and defend it in 3-4 sentences.</w:t>
+        <w:t xml:space="preserve">When a chatbot gives wrong advice and a customer suffers because of it, who should be held responsible: the company that built the chatbot, the business that deployed it (Air Canada), or the customer who trusted it? The tribunal has already ruled on this case. Do you agree with its decision? Take a position and defend it in 3-4 sentences.</w:t>
       </w:r>
     </w:p>
     <w:p>
@@ -917,7 +888,7 @@
         <w:pStyle w:val="Heading3"/>
       </w:pPr>
       <w:r>
-        <w:t xml:space="preserve">Question 4: The Google Gemini Image Crisis</w:t>
+        <w:t xml:space="preserve">Question 4: The Google Gemini image crisis</w:t>
       </w:r>
     </w:p>
     <w:p>
@@ -931,13 +902,10 @@
         <w:t xml:space="preserve"> </w:t>
       </w:r>
       <w:r>
-        <w:t xml:space="preserve">“1943 German soldiers.”</w:t>
-      </w:r>
-      <w:r>
-        <w:t xml:space="preserve"> </w:t>
-      </w:r>
-      <w:r>
-        <w:t xml:space="preserve">Gemini produced images of Black men and Asian women in Nazi uniforms. Similar problems appeared with prompts like</w:t>
+        <w:t xml:space="preserve">“1943 German soldiers”</w:t>
+      </w:r>
+      <w:r>
+        <w:t xml:space="preserve">. Gemini produced images of Black men and Asian women in Nazi uniforms. Similar problems appeared with prompts such as</w:t>
       </w:r>
       <w:r>
         <w:t xml:space="preserve"> </w:t>
@@ -955,13 +923,10 @@
         <w:t xml:space="preserve"> </w:t>
       </w:r>
       <w:r>
-        <w:t xml:space="preserve">“completely unacceptable,”</w:t>
-      </w:r>
-      <w:r>
-        <w:t xml:space="preserve"> </w:t>
-      </w:r>
-      <w:r>
-        <w:t xml:space="preserve">and the image generation feature was paused for weeks.</w:t>
+        <w:t xml:space="preserve">“completely unacceptable”</w:t>
+      </w:r>
+      <w:r>
+        <w:t xml:space="preserve">, and Google stopped Gemini from generating images of people for about six months.</w:t>
       </w:r>
     </w:p>
     <w:p>
@@ -984,7 +949,7 @@
         </w:numPr>
       </w:pPr>
       <w:r>
-        <w:t xml:space="preserve">Using the failure taxonomy from Lecture 14 (pipeline failure, hallucination, policy failure, data drift), classify this incident. Was it one type or a combination? Explain your reasoning.</w:t>
+        <w:t xml:space="preserve">Classify this incident using the failure types from Lecture 14 (pipeline failure, hallucination, policy failure, data drift). Was it one type or a combination? Explain your reasoning.</w:t>
       </w:r>
     </w:p>
     <w:p>
@@ -995,55 +960,7 @@
         </w:numPr>
       </w:pPr>
       <w:r>
-        <w:t xml:space="preserve">Lecture 14 argued you should</w:t>
-      </w:r>
-      <w:r>
-        <w:t xml:space="preserve"> </w:t>
-      </w:r>
-      <w:r>
-        <w:rPr>
-          <w:b/>
-          <w:bCs/>
-        </w:rPr>
-        <w:t xml:space="preserve">test for properties</w:t>
-      </w:r>
-      <w:r>
-        <w:t xml:space="preserve"> </w:t>
-      </w:r>
-      <w:r>
-        <w:t xml:space="preserve">(is it safe? is the format correct?) rather than exact outputs. Which test type from Lecture 14’s table (safety, format, consistency, boundary, bias, regression) could have caught Gemini’s problem before launch? Write one specific test case: describe the prompt you would use and what a</w:t>
-      </w:r>
-      <w:r>
-        <w:t xml:space="preserve"> </w:t>
-      </w:r>
-      <w:r>
-        <w:t xml:space="preserve">“pass”</w:t>
-      </w:r>
-      <w:r>
-        <w:t xml:space="preserve"> </w:t>
-      </w:r>
-      <w:r>
-        <w:t xml:space="preserve">vs. </w:t>
-      </w:r>
-      <w:r>
-        <w:t xml:space="preserve">“fail”</w:t>
-      </w:r>
-      <w:r>
-        <w:t xml:space="preserve"> </w:t>
-      </w:r>
-      <w:r>
-        <w:t xml:space="preserve">would look like.</w:t>
-      </w:r>
-    </w:p>
-    <w:p>
-      <w:pPr>
-        <w:numPr>
-          <w:ilvl w:val="0"/>
-          <w:numId w:val="1006"/>
-        </w:numPr>
-      </w:pPr>
-      <w:r>
-        <w:t xml:space="preserve">In your view, is overcorrecting for diversity bias worse than undercorrecting? Or are both equally bad for different reasons? Write 3-4 sentences explaining your position.</w:t>
+        <w:t xml:space="preserve">Is overcorrecting for diversity bias worse than undercorrecting, or are both bad for different reasons? Explain your position in 3-4 sentences.</w:t>
       </w:r>
     </w:p>
     <w:p>
@@ -1103,7 +1020,7 @@
         <w:pStyle w:val="Heading3"/>
       </w:pPr>
       <w:r>
-        <w:t xml:space="preserve">Question 5: Consent and the Data Supply Chain</w:t>
+        <w:t xml:space="preserve">Question 5: Consent and the data supply chain</w:t>
       </w:r>
     </w:p>
     <w:p>
@@ -1111,7 +1028,7 @@
         <w:pStyle w:val="FirstParagraph"/>
       </w:pPr>
       <w:r>
-        <w:t xml:space="preserve">Here is a scenario:</w:t>
+        <w:t xml:space="preserve">You posted photos of yourself on Instagram in 2020. In 2024, you find out they were scraped into a training dataset for a facial recognition system that police departments now use. Nobody asked you, and you did not know.</w:t>
       </w:r>
     </w:p>
     <w:p>
@@ -1119,15 +1036,7 @@
         <w:pStyle w:val="BodyText"/>
       </w:pPr>
       <w:r>
-        <w:t xml:space="preserve">You posted photos of yourself on Instagram in 2020. In 2024, you discover those photos were scraped into a training dataset for a facial recognition system now used by police departments. You never gave permission. You didn’t even know it happened.</w:t>
-      </w:r>
-    </w:p>
-    <w:p>
-      <w:pPr>
-        <w:pStyle w:val="BodyText"/>
-      </w:pPr>
-      <w:r>
-        <w:t xml:space="preserve">This sort of thing has happened in real life. Clearview AI scraped over 30 billion faces from social media without asking anyone (BBC, 2023). LAION-5B, a dataset of 5.8 billion images used to train AI image generators, was found to contain child abuse material, and the only metadata it stored was a URL and a caption (CNN, 2023).</w:t>
+        <w:t xml:space="preserve">This has happened in real life. Clearview AI scraped over 30 billion faces from social media without asking anyone (BBC, 2023). LAION-5B, a dataset of 5.8 billion images used to train AI image generators, was found to contain child abuse material, and for each image it stored only a URL and a caption (CNN, 2023).</w:t>
       </w:r>
     </w:p>
     <w:p>
@@ -1150,7 +1059,7 @@
         </w:numPr>
       </w:pPr>
       <w:r>
-        <w:t xml:space="preserve">Should companies be required to get your consent before using your publicly posted photos to train AI? Write 3-4 sentences taking a clear position. Consider: is posting something publicly the same as consenting to any use of it?</w:t>
+        <w:t xml:space="preserve">Should companies need your consent before training AI on photos you posted publicly? Take a clear position in 3-4 sentences. Is posting something publicly the same as agreeing to any use of it?</w:t>
       </w:r>
     </w:p>
     <w:p>
@@ -1161,7 +1070,7 @@
         </w:numPr>
       </w:pPr>
       <w:r>
-        <w:t xml:space="preserve">Lecture 14 mentioned Getty Images’ lawsuit against Stability AI over scraped images. Suppose courts decide that scraping publicly posted images for AI training is legal. In 2-3 sentences, explain whether that would settle the ethical question too, or whether something legal can still be wrong</w:t>
+        <w:t xml:space="preserve">Lecture 14 mentioned Getty Images’ lawsuit against Stability AI over scraped images. Suppose courts decide that scraping public images for AI training is legal. In 2-3 sentences, say whether that would settle the ethical question too, or whether something legal can still be wrong.</w:t>
       </w:r>
     </w:p>
     <w:p>
@@ -1215,13 +1124,13 @@
       </w:r>
     </w:p>
     <w:bookmarkEnd w:id="13"/>
-    <w:bookmarkStart w:id="14" w:name="bonus-question-write-a-mini-datasheet"/>
+    <w:bookmarkStart w:id="14" w:name="bonus-question-the-model-card-bluff"/>
     <w:p>
       <w:pPr>
         <w:pStyle w:val="Heading3"/>
       </w:pPr>
       <w:r>
-        <w:t xml:space="preserve">Bonus Question: Write a Mini-Datasheet</w:t>
+        <w:t xml:space="preserve">Bonus question: The model card bluff</w:t>
       </w:r>
     </w:p>
     <w:p>
@@ -1239,210 +1148,159 @@
           <w:b/>
           <w:bCs/>
         </w:rPr>
-        <w:t xml:space="preserve">datasheets for datasets</w:t>
-      </w:r>
-      <w:r>
-        <w:t xml:space="preserve">, documentation that describes where a dataset came from, what’s in it, and how it should (and shouldn’t) be used. The framework comes from Gebru et al. (2018) and has 7 sections.</w:t>
-      </w:r>
-    </w:p>
-    <w:p>
-      <w:pPr>
-        <w:pStyle w:val="BodyText"/>
-      </w:pPr>
-      <w:r>
-        <w:t xml:space="preserve">Here is a dataset you need to document:</w:t>
-      </w:r>
-    </w:p>
-    <w:p>
-      <w:pPr>
-        <w:pStyle w:val="BlockText"/>
-      </w:pPr>
+        <w:t xml:space="preserve">model cards</w:t>
+      </w:r>
+      <w:r>
+        <w:t xml:space="preserve">: short documents that say what a model is for, how it was evaluated and where it fails. Below is a model card for</w:t>
+      </w:r>
+      <w:r>
+        <w:t xml:space="preserve"> </w:t>
+      </w:r>
       <w:r>
         <w:rPr>
           <w:b/>
           <w:bCs/>
         </w:rPr>
-        <w:t xml:space="preserve">Atlanta Restaurant Reviews Dataset</w:t>
-      </w:r>
-      <w:r>
-        <w:t xml:space="preserve">: 1,000 Yelp reviews of restaurants in the Atlanta metro area, scraped in March 2024. Each entry contains the review text, a star rating (1-5), the restaurant name, the restaurant’s cuisine type, and the date of the review. The reviews were collected by a graduate student at Emory University for a class project on sentiment analysis. No usernames or profile photos were included in the scrape.</w:t>
-      </w:r>
-    </w:p>
-    <w:p>
-      <w:pPr>
-        <w:pStyle w:val="FirstParagraph"/>
+        <w:t xml:space="preserve">MediScreen</w:t>
+      </w:r>
+      <w:r>
+        <w:t xml:space="preserve">, an AI system that reads chest X-rays and flags possible pneumonia for radiologists to review. The vendor’s marketing team wrote it.</w:t>
+      </w:r>
+    </w:p>
+    <w:p>
+      <w:pPr>
+        <w:pStyle w:val="BlockText"/>
       </w:pPr>
       <w:r>
         <w:rPr>
           <w:b/>
           <w:bCs/>
         </w:rPr>
+        <w:t xml:space="preserve">Model Card: MediScreen v2.1</w:t>
+      </w:r>
+    </w:p>
+    <w:p>
+      <w:pPr>
+        <w:pStyle w:val="BlockText"/>
+      </w:pPr>
+      <w:r>
+        <w:rPr>
+          <w:b/>
+          <w:bCs/>
+        </w:rPr>
+        <w:t xml:space="preserve">Model description:</w:t>
+      </w:r>
+      <w:r>
+        <w:t xml:space="preserve"> </w:t>
+      </w:r>
+      <w:r>
+        <w:t xml:space="preserve">MediScreen uses deep learning to detect pneumonia in chest X-rays with industry-leading accuracy.</w:t>
+      </w:r>
+    </w:p>
+    <w:p>
+      <w:pPr>
+        <w:pStyle w:val="BlockText"/>
+      </w:pPr>
+      <w:r>
+        <w:rPr>
+          <w:b/>
+          <w:bCs/>
+        </w:rPr>
+        <w:t xml:space="preserve">Training data:</w:t>
+      </w:r>
+      <w:r>
+        <w:t xml:space="preserve"> </w:t>
+      </w:r>
+      <w:r>
+        <w:t xml:space="preserve">50,000 chest X-rays of adult patients from three Boston hospitals, collected between 2015 and 2017.</w:t>
+      </w:r>
+    </w:p>
+    <w:p>
+      <w:pPr>
+        <w:pStyle w:val="BlockText"/>
+      </w:pPr>
+      <w:r>
+        <w:rPr>
+          <w:b/>
+          <w:bCs/>
+        </w:rPr>
+        <w:t xml:space="preserve">Performance:</w:t>
+      </w:r>
+      <w:r>
+        <w:t xml:space="preserve"> </w:t>
+      </w:r>
+      <w:r>
+        <w:t xml:space="preserve">96% accuracy on our test set. The model performs well across all patient groups.</w:t>
+      </w:r>
+    </w:p>
+    <w:p>
+      <w:pPr>
+        <w:pStyle w:val="BlockText"/>
+      </w:pPr>
+      <w:r>
+        <w:rPr>
+          <w:b/>
+          <w:bCs/>
+        </w:rPr>
+        <w:t xml:space="preserve">Intended use:</w:t>
+      </w:r>
+      <w:r>
+        <w:t xml:space="preserve"> </w:t>
+      </w:r>
+      <w:r>
+        <w:t xml:space="preserve">Hospitals and clinics worldwide, for patients of all ages.</w:t>
+      </w:r>
+    </w:p>
+    <w:p>
+      <w:pPr>
+        <w:pStyle w:val="BlockText"/>
+      </w:pPr>
+      <w:r>
+        <w:rPr>
+          <w:b/>
+          <w:bCs/>
+        </w:rPr>
+        <w:t xml:space="preserve">Limitations:</w:t>
+      </w:r>
+      <w:r>
+        <w:t xml:space="preserve"> </w:t>
+      </w:r>
+      <w:r>
+        <w:t xml:space="preserve">No significant limitations were found in our testing.</w:t>
+      </w:r>
+    </w:p>
+    <w:p>
+      <w:pPr>
+        <w:pStyle w:val="FirstParagraph"/>
+      </w:pPr>
+      <w:r>
+        <w:rPr>
+          <w:b/>
+          <w:bCs/>
+        </w:rPr>
         <w:t xml:space="preserve">Your task:</w:t>
       </w:r>
     </w:p>
     <w:p>
       <w:pPr>
-        <w:pStyle w:val="BodyText"/>
-      </w:pPr>
-      <w:r>
-        <w:t xml:space="preserve">Fill out each of the 7 datasheet sections below. You’ll need to think carefully about what information is available and what’s missing. Some sections will require you to make reasonable assumptions — state those assumptions shortly but clearly.</w:t>
-      </w:r>
-    </w:p>
-    <w:p>
-      <w:pPr>
-        <w:pStyle w:val="Compact"/>
         <w:numPr>
           <w:ilvl w:val="0"/>
           <w:numId w:val="1008"/>
         </w:numPr>
       </w:pPr>
       <w:r>
-        <w:rPr>
-          <w:b/>
-          <w:bCs/>
-        </w:rPr>
-        <w:t xml:space="preserve">Motivation</w:t>
-      </w:r>
-      <w:r>
-        <w:t xml:space="preserve">: Why was this dataset created? Who created it and who funded it?</w:t>
-      </w:r>
-    </w:p>
-    <w:p>
-      <w:pPr>
-        <w:pStyle w:val="Compact"/>
+        <w:t xml:space="preserve">Go through the card one section at a time. For each section, say in one sentence what is wrong or missing, and why it matters to a hospital. (Hint: compare the card with the Lecture 14 slides on intended use and disaggregated evaluation.)</w:t>
+      </w:r>
+    </w:p>
+    <w:p>
+      <w:pPr>
         <w:numPr>
           <w:ilvl w:val="0"/>
           <w:numId w:val="1008"/>
         </w:numPr>
       </w:pPr>
       <w:r>
-        <w:rPr>
-          <w:b/>
-          <w:bCs/>
-        </w:rPr>
-        <w:t xml:space="preserve">Composition</w:t>
-      </w:r>
-      <w:r>
-        <w:t xml:space="preserve">: What types of data are included? How many instances? Is there sensitive information?</w:t>
-      </w:r>
-    </w:p>
-    <w:p>
-      <w:pPr>
-        <w:pStyle w:val="Compact"/>
-        <w:numPr>
-          <w:ilvl w:val="0"/>
-          <w:numId w:val="1008"/>
-        </w:numPr>
-      </w:pPr>
-      <w:r>
-        <w:rPr>
-          <w:b/>
-          <w:bCs/>
-        </w:rPr>
-        <w:t xml:space="preserve">Collection</w:t>
-      </w:r>
-      <w:r>
-        <w:t xml:space="preserve">: How was the data collected? Was consent obtained from the reviewers?</w:t>
-      </w:r>
-    </w:p>
-    <w:p>
-      <w:pPr>
-        <w:pStyle w:val="Compact"/>
-        <w:numPr>
-          <w:ilvl w:val="0"/>
-          <w:numId w:val="1008"/>
-        </w:numPr>
-      </w:pPr>
-      <w:r>
-        <w:rPr>
-          <w:b/>
-          <w:bCs/>
-        </w:rPr>
-        <w:t xml:space="preserve">Preprocessing</w:t>
-      </w:r>
-      <w:r>
-        <w:t xml:space="preserve">: Was the data cleaned or filtered? Were any instances removed?</w:t>
-      </w:r>
-    </w:p>
-    <w:p>
-      <w:pPr>
-        <w:pStyle w:val="Compact"/>
-        <w:numPr>
-          <w:ilvl w:val="0"/>
-          <w:numId w:val="1008"/>
-        </w:numPr>
-      </w:pPr>
-      <w:r>
-        <w:rPr>
-          <w:b/>
-          <w:bCs/>
-        </w:rPr>
-        <w:t xml:space="preserve">Uses</w:t>
-      </w:r>
-      <w:r>
-        <w:t xml:space="preserve">: What tasks has it been used for? What should it NOT be used for?</w:t>
-      </w:r>
-    </w:p>
-    <w:p>
-      <w:pPr>
-        <w:pStyle w:val="Compact"/>
-        <w:numPr>
-          <w:ilvl w:val="0"/>
-          <w:numId w:val="1008"/>
-        </w:numPr>
-      </w:pPr>
-      <w:r>
-        <w:rPr>
-          <w:b/>
-          <w:bCs/>
-        </w:rPr>
-        <w:t xml:space="preserve">Distribution</w:t>
-      </w:r>
-      <w:r>
-        <w:t xml:space="preserve">: How is the dataset shared? Is it versioned?</w:t>
-      </w:r>
-    </w:p>
-    <w:p>
-      <w:pPr>
-        <w:pStyle w:val="Compact"/>
-        <w:numPr>
-          <w:ilvl w:val="0"/>
-          <w:numId w:val="1008"/>
-        </w:numPr>
-      </w:pPr>
-      <w:r>
-        <w:rPr>
-          <w:b/>
-          <w:bCs/>
-        </w:rPr>
-        <w:t xml:space="preserve">Maintenance</w:t>
-      </w:r>
-      <w:r>
-        <w:t xml:space="preserve">: Who is responsible for updates? Is there a way to report issues?</w:t>
-      </w:r>
-    </w:p>
-    <w:p>
-      <w:pPr>
-        <w:pStyle w:val="FirstParagraph"/>
-      </w:pPr>
-      <w:r>
-        <w:t xml:space="preserve">After filling out the datasheet, identify</w:t>
-      </w:r>
-      <w:r>
-        <w:t xml:space="preserve"> </w:t>
-      </w:r>
-      <w:r>
-        <w:rPr>
-          <w:b/>
-          <w:bCs/>
-        </w:rPr>
-        <w:t xml:space="preserve">2 ethical concerns</w:t>
-      </w:r>
-      <w:r>
-        <w:t xml:space="preserve"> </w:t>
-      </w:r>
-      <w:r>
-        <w:t xml:space="preserve">with this dataset that the datasheet helps reveal.</w:t>
+        <w:t xml:space="preserve">A hospital outside the United States is thinking of buying MediScreen. Which problem should worry it most? Explain why in 2-3 sentences.</w:t>
       </w:r>
     </w:p>
     <w:p>

</xml_diff>

<commit_message>
content(assignments): rewrite A07 around agents and setup; simplify A06 headings
A07 now covers Lectures 15-16 only (released 22 Oct, before bias is
taught). The old bias questions move to A08.
</commit_message>
<xml_diff>
--- a/assignments/06-assignment.docx
+++ b/assignments/06-assignment.docx
@@ -246,13 +246,13 @@
         </w:pict>
       </w:r>
     </w:p>
-    <w:bookmarkStart w:id="9" w:name="question-1-the-dpd-chatbot-post-mortem"/>
+    <w:bookmarkStart w:id="9" w:name="question-1"/>
     <w:p>
       <w:pPr>
         <w:pStyle w:val="Heading3"/>
       </w:pPr>
       <w:r>
-        <w:t xml:space="preserve">Question 1: The DPD chatbot post-mortem</w:t>
+        <w:t xml:space="preserve">Question 1</w:t>
       </w:r>
     </w:p>
     <w:p>
@@ -441,13 +441,13 @@
       </w:r>
     </w:p>
     <w:bookmarkEnd w:id="9"/>
-    <w:bookmarkStart w:id="10" w:name="question-2-drift-after-covid"/>
+    <w:bookmarkStart w:id="10" w:name="question-2"/>
     <w:p>
       <w:pPr>
         <w:pStyle w:val="Heading3"/>
       </w:pPr>
       <w:r>
-        <w:t xml:space="preserve">Question 2: Drift after COVID</w:t>
+        <w:t xml:space="preserve">Question 2</w:t>
       </w:r>
     </w:p>
     <w:p>
@@ -732,13 +732,13 @@
       </w:r>
     </w:p>
     <w:bookmarkEnd w:id="10"/>
-    <w:bookmarkStart w:id="11" w:name="Xe2dd75b9913c09f1d28d9e1bf2269bf566d6bd5"/>
+    <w:bookmarkStart w:id="11" w:name="question-3"/>
     <w:p>
       <w:pPr>
         <w:pStyle w:val="Heading3"/>
       </w:pPr>
       <w:r>
-        <w:t xml:space="preserve">Question 3: Output validation and the Air Canada chatbot</w:t>
+        <w:t xml:space="preserve">Question 3</w:t>
       </w:r>
     </w:p>
     <w:p>
@@ -882,13 +882,13 @@
       </w:r>
     </w:p>
     <w:bookmarkEnd w:id="11"/>
-    <w:bookmarkStart w:id="12" w:name="Xa2ac6906e9c98e356b35189f2242aaebaa1e884"/>
+    <w:bookmarkStart w:id="12" w:name="question-4"/>
     <w:p>
       <w:pPr>
         <w:pStyle w:val="Heading3"/>
       </w:pPr>
       <w:r>
-        <w:t xml:space="preserve">Question 4: The Google Gemini image crisis</w:t>
+        <w:t xml:space="preserve">Question 4</w:t>
       </w:r>
     </w:p>
     <w:p>
@@ -1014,13 +1014,13 @@
       </w:r>
     </w:p>
     <w:bookmarkEnd w:id="12"/>
-    <w:bookmarkStart w:id="13" w:name="Xf34540dc94fc457fd9b7008041ff51e0e061e79"/>
+    <w:bookmarkStart w:id="13" w:name="question-5"/>
     <w:p>
       <w:pPr>
         <w:pStyle w:val="Heading3"/>
       </w:pPr>
       <w:r>
-        <w:t xml:space="preserve">Question 5: Consent and the data supply chain</w:t>
+        <w:t xml:space="preserve">Question 5</w:t>
       </w:r>
     </w:p>
     <w:p>
@@ -1124,13 +1124,13 @@
       </w:r>
     </w:p>
     <w:bookmarkEnd w:id="13"/>
-    <w:bookmarkStart w:id="14" w:name="bonus-question-the-model-card-bluff"/>
+    <w:bookmarkStart w:id="14" w:name="bonus-question"/>
     <w:p>
       <w:pPr>
         <w:pStyle w:val="Heading3"/>
       </w:pPr>
       <w:r>
-        <w:t xml:space="preserve">Bonus question: The model card bluff</w:t>
+        <w:t xml:space="preserve">Bonus question</w:t>
       </w:r>
     </w:p>
     <w:p>

</xml_diff>